<commit_message>
Exam duty: add 127303 (21 Oct, PSB1205/1206), move Phitcha to PSB1306 and Sakaokawin to PSB1312
Co-Authored-By: Claude Opus 5.5 <noreply@anthropic.com>
Claude-Session: https://claude.ai/code/session_01FapC72tTBB8AqE8phsKq6c
</commit_message>
<xml_diff>
--- a/exam-duty-dashboard/คำสั่งกรรมการคุมสอบรายบุคคล_ปลายภาค1-2569.docx
+++ b/exam-duty-dashboard/คำสั่งกรรมการคุมสอบรายบุคคล_ปลายภาค1-2569.docx
@@ -9812,7 +9812,7 @@
                 <w:sz w:val="30"/>
                 <w:szCs w:val="30"/>
               </w:rPr>
-              <w:t>PSB 1312</w:t>
+              <w:t>PSB 1306</w:t>
             </w:r>
           </w:p>
         </w:tc>
@@ -19599,7 +19599,7 @@
                 <w:sz w:val="30"/>
                 <w:szCs w:val="30"/>
               </w:rPr>
-              <w:t>คณะเศรษฐศาสตร์ (แจ้งเลขห้องภายหลัง)</w:t>
+              <w:t>PSB 1312</w:t>
             </w:r>
           </w:p>
         </w:tc>
@@ -19629,7 +19629,7 @@
                 <w:sz w:val="30"/>
                 <w:szCs w:val="30"/>
               </w:rPr>
-              <w:t>126101 702 000</w:t>
+              <w:t>126101 004 000</w:t>
             </w:r>
           </w:p>
         </w:tc>
@@ -20538,7 +20538,7 @@
                 <w:sz w:val="30"/>
                 <w:szCs w:val="30"/>
               </w:rPr>
-              <w:t>อาทิตย์ 25 ต.ค. 2569</w:t>
+              <w:t>พุธ 21 ต.ค. 2569</w:t>
             </w:r>
           </w:p>
         </w:tc>
@@ -20568,7 +20568,7 @@
                 <w:sz w:val="30"/>
                 <w:szCs w:val="30"/>
               </w:rPr>
-              <w:t>08:00 - 11:00</w:t>
+              <w:t>12:00 - 15:00</w:t>
             </w:r>
           </w:p>
         </w:tc>
@@ -20628,7 +20628,7 @@
                 <w:sz w:val="30"/>
                 <w:szCs w:val="30"/>
               </w:rPr>
-              <w:t>128357 001 000</w:t>
+              <w:t>127303 001 000</w:t>
             </w:r>
           </w:p>
         </w:tc>
@@ -20699,7 +20699,7 @@
                 <w:sz w:val="30"/>
                 <w:szCs w:val="30"/>
               </w:rPr>
-              <w:t>อังคาร 27 ต.ค. 2569</w:t>
+              <w:t>อาทิตย์ 25 ต.ค. 2569</w:t>
             </w:r>
           </w:p>
         </w:tc>
@@ -20729,7 +20729,7 @@
                 <w:sz w:val="30"/>
                 <w:szCs w:val="30"/>
               </w:rPr>
-              <w:t>12:00 - 15:00</w:t>
+              <w:t>08:00 - 11:00</w:t>
             </w:r>
           </w:p>
         </w:tc>
@@ -20759,7 +20759,7 @@
                 <w:sz w:val="30"/>
                 <w:szCs w:val="30"/>
               </w:rPr>
-              <w:t>PSB 1101</w:t>
+              <w:t>PSB 1206</w:t>
             </w:r>
           </w:p>
         </w:tc>
@@ -20789,7 +20789,7 @@
                 <w:sz w:val="30"/>
                 <w:szCs w:val="30"/>
               </w:rPr>
-              <w:t>128203 001 000</w:t>
+              <w:t>128357 001 000</w:t>
             </w:r>
           </w:p>
         </w:tc>
@@ -20831,6 +20831,167 @@
                 <w:szCs w:val="30"/>
               </w:rPr>
               <w:t>3</w:t>
+            </w:r>
+          </w:p>
+        </w:tc>
+        <w:tc>
+          <w:tcPr>
+            <w:tcW w:w="2100" w:type="dxa"/>
+            <w:tcBorders>
+              <w:top w:val="single" w:sz="6" w:space="0" w:color="000000"/>
+              <w:left w:val="single" w:sz="6" w:space="0" w:color="000000"/>
+              <w:bottom w:val="single" w:sz="6" w:space="0" w:color="000000"/>
+              <w:right w:val="single" w:sz="6" w:space="0" w:color="000000"/>
+            </w:tcBorders>
+            <w:tcMar>
+              <w:top w:w="20" w:type="dxa"/>
+              <w:left w:w="80" w:type="dxa"/>
+              <w:bottom w:w="20" w:type="dxa"/>
+              <w:right w:w="80" w:type="dxa"/>
+            </w:tcMar>
+            <w:vAlign w:val="center"/>
+          </w:tcPr>
+          <w:p>
+            <w:pPr>
+              <w:jc w:val="left"/>
+            </w:pPr>
+            <w:r>
+              <w:rPr>
+                <w:sz w:val="30"/>
+                <w:szCs w:val="30"/>
+              </w:rPr>
+              <w:t>อังคาร 27 ต.ค. 2569</w:t>
+            </w:r>
+          </w:p>
+        </w:tc>
+        <w:tc>
+          <w:tcPr>
+            <w:tcW w:w="1450" w:type="dxa"/>
+            <w:tcBorders>
+              <w:top w:val="single" w:sz="6" w:space="0" w:color="000000"/>
+              <w:left w:val="single" w:sz="6" w:space="0" w:color="000000"/>
+              <w:bottom w:val="single" w:sz="6" w:space="0" w:color="000000"/>
+              <w:right w:val="single" w:sz="6" w:space="0" w:color="000000"/>
+            </w:tcBorders>
+            <w:tcMar>
+              <w:top w:w="20" w:type="dxa"/>
+              <w:left w:w="80" w:type="dxa"/>
+              <w:bottom w:w="20" w:type="dxa"/>
+              <w:right w:w="80" w:type="dxa"/>
+            </w:tcMar>
+            <w:vAlign w:val="center"/>
+          </w:tcPr>
+          <w:p>
+            <w:pPr>
+              <w:jc w:val="left"/>
+            </w:pPr>
+            <w:r>
+              <w:rPr>
+                <w:sz w:val="30"/>
+                <w:szCs w:val="30"/>
+              </w:rPr>
+              <w:t>12:00 - 15:00</w:t>
+            </w:r>
+          </w:p>
+        </w:tc>
+        <w:tc>
+          <w:tcPr>
+            <w:tcW w:w="2500" w:type="dxa"/>
+            <w:tcBorders>
+              <w:top w:val="single" w:sz="6" w:space="0" w:color="000000"/>
+              <w:left w:val="single" w:sz="6" w:space="0" w:color="000000"/>
+              <w:bottom w:val="single" w:sz="6" w:space="0" w:color="000000"/>
+              <w:right w:val="single" w:sz="6" w:space="0" w:color="000000"/>
+            </w:tcBorders>
+            <w:tcMar>
+              <w:top w:w="20" w:type="dxa"/>
+              <w:left w:w="80" w:type="dxa"/>
+              <w:bottom w:w="20" w:type="dxa"/>
+              <w:right w:w="80" w:type="dxa"/>
+            </w:tcMar>
+            <w:vAlign w:val="center"/>
+          </w:tcPr>
+          <w:p>
+            <w:pPr>
+              <w:jc w:val="left"/>
+            </w:pPr>
+            <w:r>
+              <w:rPr>
+                <w:sz w:val="30"/>
+                <w:szCs w:val="30"/>
+              </w:rPr>
+              <w:t>PSB 1101</w:t>
+            </w:r>
+          </w:p>
+        </w:tc>
+        <w:tc>
+          <w:tcPr>
+            <w:tcW w:w="2504" w:type="dxa"/>
+            <w:tcBorders>
+              <w:top w:val="single" w:sz="6" w:space="0" w:color="000000"/>
+              <w:left w:val="single" w:sz="6" w:space="0" w:color="000000"/>
+              <w:bottom w:val="single" w:sz="6" w:space="0" w:color="000000"/>
+              <w:right w:val="single" w:sz="6" w:space="0" w:color="000000"/>
+            </w:tcBorders>
+            <w:tcMar>
+              <w:top w:w="20" w:type="dxa"/>
+              <w:left w:w="80" w:type="dxa"/>
+              <w:bottom w:w="20" w:type="dxa"/>
+              <w:right w:w="80" w:type="dxa"/>
+            </w:tcMar>
+            <w:vAlign w:val="center"/>
+          </w:tcPr>
+          <w:p>
+            <w:pPr>
+              <w:jc w:val="left"/>
+            </w:pPr>
+            <w:r>
+              <w:rPr>
+                <w:sz w:val="30"/>
+                <w:szCs w:val="30"/>
+              </w:rPr>
+              <w:t>128203 001 000</w:t>
+            </w:r>
+          </w:p>
+        </w:tc>
+      </w:tr>
+      <w:tr>
+        <w:tblPrEx>
+          <w:tblCellMar>
+            <w:top w:w="0" w:type="dxa"/>
+            <w:bottom w:w="0" w:type="dxa"/>
+          </w:tblCellMar>
+        </w:tblPrEx>
+        <w:trPr>
+          <w:cantSplit/>
+        </w:trPr>
+        <w:tc>
+          <w:tcPr>
+            <w:tcW w:w="800" w:type="dxa"/>
+            <w:tcBorders>
+              <w:top w:val="single" w:sz="6" w:space="0" w:color="000000"/>
+              <w:left w:val="single" w:sz="6" w:space="0" w:color="000000"/>
+              <w:bottom w:val="single" w:sz="6" w:space="0" w:color="000000"/>
+              <w:right w:val="single" w:sz="6" w:space="0" w:color="000000"/>
+            </w:tcBorders>
+            <w:tcMar>
+              <w:top w:w="20" w:type="dxa"/>
+              <w:left w:w="80" w:type="dxa"/>
+              <w:bottom w:w="20" w:type="dxa"/>
+              <w:right w:w="80" w:type="dxa"/>
+            </w:tcMar>
+            <w:vAlign w:val="center"/>
+          </w:tcPr>
+          <w:p>
+            <w:pPr>
+              <w:jc w:val="left"/>
+            </w:pPr>
+            <w:r>
+              <w:rPr>
+                <w:sz w:val="30"/>
+                <w:szCs w:val="30"/>
+              </w:rPr>
+              <w:t>4</w:t>
             </w:r>
           </w:p>
         </w:tc>
@@ -25822,6 +25983,167 @@
                 <w:sz w:val="30"/>
                 <w:szCs w:val="30"/>
               </w:rPr>
+              <w:t>พุธ 21 ต.ค. 2569</w:t>
+            </w:r>
+          </w:p>
+        </w:tc>
+        <w:tc>
+          <w:tcPr>
+            <w:tcW w:w="1450" w:type="dxa"/>
+            <w:tcBorders>
+              <w:top w:val="single" w:sz="6" w:space="0" w:color="000000"/>
+              <w:left w:val="single" w:sz="6" w:space="0" w:color="000000"/>
+              <w:bottom w:val="single" w:sz="6" w:space="0" w:color="000000"/>
+              <w:right w:val="single" w:sz="6" w:space="0" w:color="000000"/>
+            </w:tcBorders>
+            <w:tcMar>
+              <w:top w:w="20" w:type="dxa"/>
+              <w:left w:w="80" w:type="dxa"/>
+              <w:bottom w:w="20" w:type="dxa"/>
+              <w:right w:w="80" w:type="dxa"/>
+            </w:tcMar>
+            <w:vAlign w:val="center"/>
+          </w:tcPr>
+          <w:p>
+            <w:pPr>
+              <w:jc w:val="left"/>
+            </w:pPr>
+            <w:r>
+              <w:rPr>
+                <w:sz w:val="30"/>
+                <w:szCs w:val="30"/>
+              </w:rPr>
+              <w:t>12:00 - 15:00</w:t>
+            </w:r>
+          </w:p>
+        </w:tc>
+        <w:tc>
+          <w:tcPr>
+            <w:tcW w:w="2500" w:type="dxa"/>
+            <w:tcBorders>
+              <w:top w:val="single" w:sz="6" w:space="0" w:color="000000"/>
+              <w:left w:val="single" w:sz="6" w:space="0" w:color="000000"/>
+              <w:bottom w:val="single" w:sz="6" w:space="0" w:color="000000"/>
+              <w:right w:val="single" w:sz="6" w:space="0" w:color="000000"/>
+            </w:tcBorders>
+            <w:tcMar>
+              <w:top w:w="20" w:type="dxa"/>
+              <w:left w:w="80" w:type="dxa"/>
+              <w:bottom w:w="20" w:type="dxa"/>
+              <w:right w:w="80" w:type="dxa"/>
+            </w:tcMar>
+            <w:vAlign w:val="center"/>
+          </w:tcPr>
+          <w:p>
+            <w:pPr>
+              <w:jc w:val="left"/>
+            </w:pPr>
+            <w:r>
+              <w:rPr>
+                <w:sz w:val="30"/>
+                <w:szCs w:val="30"/>
+              </w:rPr>
+              <w:t>PSB 1205</w:t>
+            </w:r>
+          </w:p>
+        </w:tc>
+        <w:tc>
+          <w:tcPr>
+            <w:tcW w:w="2504" w:type="dxa"/>
+            <w:tcBorders>
+              <w:top w:val="single" w:sz="6" w:space="0" w:color="000000"/>
+              <w:left w:val="single" w:sz="6" w:space="0" w:color="000000"/>
+              <w:bottom w:val="single" w:sz="6" w:space="0" w:color="000000"/>
+              <w:right w:val="single" w:sz="6" w:space="0" w:color="000000"/>
+            </w:tcBorders>
+            <w:tcMar>
+              <w:top w:w="20" w:type="dxa"/>
+              <w:left w:w="80" w:type="dxa"/>
+              <w:bottom w:w="20" w:type="dxa"/>
+              <w:right w:w="80" w:type="dxa"/>
+            </w:tcMar>
+            <w:vAlign w:val="center"/>
+          </w:tcPr>
+          <w:p>
+            <w:pPr>
+              <w:jc w:val="left"/>
+            </w:pPr>
+            <w:r>
+              <w:rPr>
+                <w:sz w:val="30"/>
+                <w:szCs w:val="30"/>
+              </w:rPr>
+              <w:t>127303 001 000</w:t>
+            </w:r>
+          </w:p>
+        </w:tc>
+      </w:tr>
+      <w:tr>
+        <w:tblPrEx>
+          <w:tblCellMar>
+            <w:top w:w="0" w:type="dxa"/>
+            <w:bottom w:w="0" w:type="dxa"/>
+          </w:tblCellMar>
+        </w:tblPrEx>
+        <w:trPr>
+          <w:cantSplit/>
+        </w:trPr>
+        <w:tc>
+          <w:tcPr>
+            <w:tcW w:w="800" w:type="dxa"/>
+            <w:tcBorders>
+              <w:top w:val="single" w:sz="6" w:space="0" w:color="000000"/>
+              <w:left w:val="single" w:sz="6" w:space="0" w:color="000000"/>
+              <w:bottom w:val="single" w:sz="6" w:space="0" w:color="000000"/>
+              <w:right w:val="single" w:sz="6" w:space="0" w:color="000000"/>
+            </w:tcBorders>
+            <w:tcMar>
+              <w:top w:w="20" w:type="dxa"/>
+              <w:left w:w="80" w:type="dxa"/>
+              <w:bottom w:w="20" w:type="dxa"/>
+              <w:right w:w="80" w:type="dxa"/>
+            </w:tcMar>
+            <w:vAlign w:val="center"/>
+          </w:tcPr>
+          <w:p>
+            <w:pPr>
+              <w:jc w:val="left"/>
+            </w:pPr>
+            <w:r>
+              <w:rPr>
+                <w:sz w:val="30"/>
+                <w:szCs w:val="30"/>
+              </w:rPr>
+              <w:t>2</w:t>
+            </w:r>
+          </w:p>
+        </w:tc>
+        <w:tc>
+          <w:tcPr>
+            <w:tcW w:w="2100" w:type="dxa"/>
+            <w:tcBorders>
+              <w:top w:val="single" w:sz="6" w:space="0" w:color="000000"/>
+              <w:left w:val="single" w:sz="6" w:space="0" w:color="000000"/>
+              <w:bottom w:val="single" w:sz="6" w:space="0" w:color="000000"/>
+              <w:right w:val="single" w:sz="6" w:space="0" w:color="000000"/>
+            </w:tcBorders>
+            <w:tcMar>
+              <w:top w:w="20" w:type="dxa"/>
+              <w:left w:w="80" w:type="dxa"/>
+              <w:bottom w:w="20" w:type="dxa"/>
+              <w:right w:w="80" w:type="dxa"/>
+            </w:tcMar>
+            <w:vAlign w:val="center"/>
+          </w:tcPr>
+          <w:p>
+            <w:pPr>
+              <w:jc w:val="left"/>
+            </w:pPr>
+            <w:r>
+              <w:rPr>
+                <w:sz w:val="30"/>
+                <w:szCs w:val="30"/>
+              </w:rPr>
               <w:t>อังคาร 27 ต.ค. 2569</w:t>
             </w:r>
           </w:p>
@@ -29624,7 +29946,7 @@
                 <w:sz w:val="30"/>
                 <w:szCs w:val="30"/>
               </w:rPr>
-              <w:t>จันทร์ 26 ต.ค. 2569</w:t>
+              <w:t>พุธ 21 ต.ค. 2569</w:t>
             </w:r>
           </w:p>
         </w:tc>
@@ -29654,7 +29976,7 @@
                 <w:sz w:val="30"/>
                 <w:szCs w:val="30"/>
               </w:rPr>
-              <w:t>08:00 - 11:00</w:t>
+              <w:t>12:00 - 15:00</w:t>
             </w:r>
           </w:p>
         </w:tc>
@@ -29684,7 +30006,7 @@
                 <w:sz w:val="30"/>
                 <w:szCs w:val="30"/>
               </w:rPr>
-              <w:t>PSB 1207</w:t>
+              <w:t>PSB 1206</w:t>
             </w:r>
           </w:p>
         </w:tc>
@@ -29714,7 +30036,7 @@
                 <w:sz w:val="30"/>
                 <w:szCs w:val="30"/>
               </w:rPr>
-              <w:t>126324 001 000</w:t>
+              <w:t>127303 001 000</w:t>
             </w:r>
           </w:p>
         </w:tc>
@@ -29785,7 +30107,7 @@
                 <w:sz w:val="30"/>
                 <w:szCs w:val="30"/>
               </w:rPr>
-              <w:t>อังคาร 27 ต.ค. 2569</w:t>
+              <w:t>จันทร์ 26 ต.ค. 2569</w:t>
             </w:r>
           </w:p>
         </w:tc>
@@ -29815,7 +30137,7 @@
                 <w:sz w:val="30"/>
                 <w:szCs w:val="30"/>
               </w:rPr>
-              <w:t>12:00 - 15:00</w:t>
+              <w:t>08:00 - 11:00</w:t>
             </w:r>
           </w:p>
         </w:tc>
@@ -29845,7 +30167,7 @@
                 <w:sz w:val="30"/>
                 <w:szCs w:val="30"/>
               </w:rPr>
-              <w:t>PSB 1205</w:t>
+              <w:t>PSB 1207</w:t>
             </w:r>
           </w:p>
         </w:tc>
@@ -29875,7 +30197,7 @@
                 <w:sz w:val="30"/>
                 <w:szCs w:val="30"/>
               </w:rPr>
-              <w:t>126101 006 000</w:t>
+              <w:t>126324 001 000</w:t>
             </w:r>
           </w:p>
         </w:tc>
@@ -29917,6 +30239,167 @@
                 <w:szCs w:val="30"/>
               </w:rPr>
               <w:t>3</w:t>
+            </w:r>
+          </w:p>
+        </w:tc>
+        <w:tc>
+          <w:tcPr>
+            <w:tcW w:w="2100" w:type="dxa"/>
+            <w:tcBorders>
+              <w:top w:val="single" w:sz="6" w:space="0" w:color="000000"/>
+              <w:left w:val="single" w:sz="6" w:space="0" w:color="000000"/>
+              <w:bottom w:val="single" w:sz="6" w:space="0" w:color="000000"/>
+              <w:right w:val="single" w:sz="6" w:space="0" w:color="000000"/>
+            </w:tcBorders>
+            <w:tcMar>
+              <w:top w:w="20" w:type="dxa"/>
+              <w:left w:w="80" w:type="dxa"/>
+              <w:bottom w:w="20" w:type="dxa"/>
+              <w:right w:w="80" w:type="dxa"/>
+            </w:tcMar>
+            <w:vAlign w:val="center"/>
+          </w:tcPr>
+          <w:p>
+            <w:pPr>
+              <w:jc w:val="left"/>
+            </w:pPr>
+            <w:r>
+              <w:rPr>
+                <w:sz w:val="30"/>
+                <w:szCs w:val="30"/>
+              </w:rPr>
+              <w:t>อังคาร 27 ต.ค. 2569</w:t>
+            </w:r>
+          </w:p>
+        </w:tc>
+        <w:tc>
+          <w:tcPr>
+            <w:tcW w:w="1450" w:type="dxa"/>
+            <w:tcBorders>
+              <w:top w:val="single" w:sz="6" w:space="0" w:color="000000"/>
+              <w:left w:val="single" w:sz="6" w:space="0" w:color="000000"/>
+              <w:bottom w:val="single" w:sz="6" w:space="0" w:color="000000"/>
+              <w:right w:val="single" w:sz="6" w:space="0" w:color="000000"/>
+            </w:tcBorders>
+            <w:tcMar>
+              <w:top w:w="20" w:type="dxa"/>
+              <w:left w:w="80" w:type="dxa"/>
+              <w:bottom w:w="20" w:type="dxa"/>
+              <w:right w:w="80" w:type="dxa"/>
+            </w:tcMar>
+            <w:vAlign w:val="center"/>
+          </w:tcPr>
+          <w:p>
+            <w:pPr>
+              <w:jc w:val="left"/>
+            </w:pPr>
+            <w:r>
+              <w:rPr>
+                <w:sz w:val="30"/>
+                <w:szCs w:val="30"/>
+              </w:rPr>
+              <w:t>12:00 - 15:00</w:t>
+            </w:r>
+          </w:p>
+        </w:tc>
+        <w:tc>
+          <w:tcPr>
+            <w:tcW w:w="2500" w:type="dxa"/>
+            <w:tcBorders>
+              <w:top w:val="single" w:sz="6" w:space="0" w:color="000000"/>
+              <w:left w:val="single" w:sz="6" w:space="0" w:color="000000"/>
+              <w:bottom w:val="single" w:sz="6" w:space="0" w:color="000000"/>
+              <w:right w:val="single" w:sz="6" w:space="0" w:color="000000"/>
+            </w:tcBorders>
+            <w:tcMar>
+              <w:top w:w="20" w:type="dxa"/>
+              <w:left w:w="80" w:type="dxa"/>
+              <w:bottom w:w="20" w:type="dxa"/>
+              <w:right w:w="80" w:type="dxa"/>
+            </w:tcMar>
+            <w:vAlign w:val="center"/>
+          </w:tcPr>
+          <w:p>
+            <w:pPr>
+              <w:jc w:val="left"/>
+            </w:pPr>
+            <w:r>
+              <w:rPr>
+                <w:sz w:val="30"/>
+                <w:szCs w:val="30"/>
+              </w:rPr>
+              <w:t>PSB 1205</w:t>
+            </w:r>
+          </w:p>
+        </w:tc>
+        <w:tc>
+          <w:tcPr>
+            <w:tcW w:w="2504" w:type="dxa"/>
+            <w:tcBorders>
+              <w:top w:val="single" w:sz="6" w:space="0" w:color="000000"/>
+              <w:left w:val="single" w:sz="6" w:space="0" w:color="000000"/>
+              <w:bottom w:val="single" w:sz="6" w:space="0" w:color="000000"/>
+              <w:right w:val="single" w:sz="6" w:space="0" w:color="000000"/>
+            </w:tcBorders>
+            <w:tcMar>
+              <w:top w:w="20" w:type="dxa"/>
+              <w:left w:w="80" w:type="dxa"/>
+              <w:bottom w:w="20" w:type="dxa"/>
+              <w:right w:w="80" w:type="dxa"/>
+            </w:tcMar>
+            <w:vAlign w:val="center"/>
+          </w:tcPr>
+          <w:p>
+            <w:pPr>
+              <w:jc w:val="left"/>
+            </w:pPr>
+            <w:r>
+              <w:rPr>
+                <w:sz w:val="30"/>
+                <w:szCs w:val="30"/>
+              </w:rPr>
+              <w:t>126101 006 000</w:t>
+            </w:r>
+          </w:p>
+        </w:tc>
+      </w:tr>
+      <w:tr>
+        <w:tblPrEx>
+          <w:tblCellMar>
+            <w:top w:w="0" w:type="dxa"/>
+            <w:bottom w:w="0" w:type="dxa"/>
+          </w:tblCellMar>
+        </w:tblPrEx>
+        <w:trPr>
+          <w:cantSplit/>
+        </w:trPr>
+        <w:tc>
+          <w:tcPr>
+            <w:tcW w:w="800" w:type="dxa"/>
+            <w:tcBorders>
+              <w:top w:val="single" w:sz="6" w:space="0" w:color="000000"/>
+              <w:left w:val="single" w:sz="6" w:space="0" w:color="000000"/>
+              <w:bottom w:val="single" w:sz="6" w:space="0" w:color="000000"/>
+              <w:right w:val="single" w:sz="6" w:space="0" w:color="000000"/>
+            </w:tcBorders>
+            <w:tcMar>
+              <w:top w:w="20" w:type="dxa"/>
+              <w:left w:w="80" w:type="dxa"/>
+              <w:bottom w:w="20" w:type="dxa"/>
+              <w:right w:w="80" w:type="dxa"/>
+            </w:tcMar>
+            <w:vAlign w:val="center"/>
+          </w:tcPr>
+          <w:p>
+            <w:pPr>
+              <w:jc w:val="left"/>
+            </w:pPr>
+            <w:r>
+              <w:rPr>
+                <w:sz w:val="30"/>
+                <w:szCs w:val="30"/>
+              </w:rPr>
+              <w:t>4</w:t>
             </w:r>
           </w:p>
         </w:tc>

</xml_diff>